<commit_message>
Update Bible resource content and metadata for multiple languages on 2026-06-23
</commit_message>
<xml_diff>
--- a/eng/docx/006.content.docx
+++ b/eng/docx/006.content.docx
@@ -7145,7 +7145,7 @@
         <w:rPr>
           <w:lang w:val="en_US" w:bidi="en_US"/>
         </w:rPr>
-        <w:t>The Gospels (books about Jesus's life) were written to help people understand and accept Jesus' invitation to follow him by "taking up their cross." This invitation is not just for Jesus' closest followers, called apostles. It is for everyone who wants to follow him (</w:t>
+        <w:t>The Gospels are books about the life of Jesus. They help people understand and accept the invitation from Jesus to follow him. Jesus describes this as "taking up their cross." This invitation is not just for the closest followers of Jesus, called apostles. It is for everyone who wants to follow him (</w:t>
       </w:r>
       <w:hyperlink r:id="rId262">
         <w:r>
@@ -7199,7 +7199,7 @@
         <w:rPr>
           <w:lang w:val="en_US" w:bidi="en_US"/>
         </w:rPr>
-        <w:t>). It is for all who wish to follow him (</w:t>
+        <w:t xml:space="preserve">; </w:t>
       </w:r>
       <w:hyperlink r:id="rId265">
         <w:r>
@@ -7210,134 +7210,14 @@
             <w:color w:val="0000EE"/>
             <w:u w:val="single"/>
           </w:rPr>
-          <w:t>Mark 8:34</w:t>
-        </w:r>
-      </w:hyperlink>
-      <w:r>
-        <w:rPr>
-          <w:lang w:val="en_US" w:bidi="en_US"/>
-        </w:rPr>
-        <w:t xml:space="preserve">; see also </w:t>
-      </w:r>
-      <w:hyperlink r:id="rId266">
-        <w:r>
-          <w:rPr>
-            <w:lang w:val="en_US" w:bidi="en_US"/>
-          </w:rPr>
-          <w:rPr>
-            <w:color w:val="0000EE"/>
-            <w:u w:val="single"/>
-          </w:rPr>
-          <w:t>2:15</w:t>
-        </w:r>
-      </w:hyperlink>
-      <w:r>
-        <w:rPr>
-          <w:lang w:val="en_US" w:bidi="en_US"/>
-        </w:rPr>
-        <w:t xml:space="preserve">; </w:t>
-      </w:r>
-      <w:hyperlink r:id="rId267">
-        <w:r>
-          <w:rPr>
-            <w:lang w:val="en_US" w:bidi="en_US"/>
-          </w:rPr>
-          <w:rPr>
-            <w:color w:val="0000EE"/>
-            <w:u w:val="single"/>
-          </w:rPr>
-          <w:t>10:21</w:t>
-        </w:r>
-      </w:hyperlink>
-      <w:r>
-        <w:rPr>
-          <w:lang w:val="en_US" w:bidi="en_US"/>
-        </w:rPr>
-        <w:t xml:space="preserve">, </w:t>
-      </w:r>
-      <w:hyperlink r:id="rId268">
-        <w:r>
-          <w:rPr>
-            <w:lang w:val="en_US" w:bidi="en_US"/>
-          </w:rPr>
-          <w:rPr>
-            <w:color w:val="0000EE"/>
-            <w:u w:val="single"/>
-          </w:rPr>
-          <w:t>52</w:t>
-        </w:r>
-      </w:hyperlink>
-      <w:r>
-        <w:rPr>
-          <w:lang w:val="en_US" w:bidi="en_US"/>
-        </w:rPr>
-        <w:t>). Some people find it very challenging to follow Jesus, but God offers help through his grace (</w:t>
-      </w:r>
-      <w:hyperlink r:id="rId269">
-        <w:r>
-          <w:rPr>
-            <w:lang w:val="en_US" w:bidi="en_US"/>
-          </w:rPr>
-          <w:rPr>
-            <w:color w:val="0000EE"/>
-            <w:u w:val="single"/>
-          </w:rPr>
-          <w:t xml:space="preserve">Mark 10:17–25, </w:t>
-        </w:r>
-      </w:hyperlink>
-      <w:hyperlink r:id="rId270">
-        <w:r>
-          <w:rPr>
-            <w:lang w:val="en_US" w:bidi="en_US"/>
-          </w:rPr>
-          <w:rPr>
-            <w:color w:val="0000EE"/>
-            <w:u w:val="single"/>
-          </w:rPr>
-          <w:t>27</w:t>
-        </w:r>
-      </w:hyperlink>
-      <w:r>
-        <w:rPr>
-          <w:lang w:val="en_US" w:bidi="en_US"/>
-        </w:rPr>
-        <w:t>). Others find it easy to respond to Jesus' invitation (</w:t>
-      </w:r>
-      <w:hyperlink r:id="rId264">
-        <w:r>
-          <w:rPr>
-            <w:lang w:val="en_US" w:bidi="en_US"/>
-          </w:rPr>
-          <w:rPr>
-            <w:color w:val="0000EE"/>
-            <w:u w:val="single"/>
-          </w:rPr>
-          <w:t>Mark 2:14</w:t>
-        </w:r>
-      </w:hyperlink>
-      <w:r>
-        <w:rPr>
-          <w:lang w:val="en_US" w:bidi="en_US"/>
-        </w:rPr>
-        <w:t xml:space="preserve">; see also </w:t>
-      </w:r>
-      <w:hyperlink r:id="rId271">
-        <w:r>
-          <w:rPr>
-            <w:lang w:val="en_US" w:bidi="en_US"/>
-          </w:rPr>
-          <w:rPr>
-            <w:color w:val="0000EE"/>
-            <w:u w:val="single"/>
-          </w:rPr>
-          <w:t>Luke 7:36–50</w:t>
-        </w:r>
-      </w:hyperlink>
-      <w:r>
-        <w:rPr>
-          <w:lang w:val="en_US" w:bidi="en_US"/>
-        </w:rPr>
-        <w:t>).</w:t>
+          <w:t>8:34</w:t>
+        </w:r>
+      </w:hyperlink>
+      <w:r>
+        <w:rPr>
+          <w:lang w:val="en_US" w:bidi="en_US"/>
+        </w:rPr>
+        <w:t xml:space="preserve">). </w:t>
       </w:r>
     </w:p>
     <w:p>
@@ -7351,44 +7231,20 @@
         <w:rPr>
           <w:lang w:val="en_US" w:bidi="en_US"/>
         </w:rPr>
-        <w:t>To "follow Jesus" means fully committing to leave behind selfish behaviors (</w:t>
-      </w:r>
-      <w:hyperlink r:id="rId272">
-        <w:r>
-          <w:rPr>
-            <w:lang w:val="en_US" w:bidi="en_US"/>
-          </w:rPr>
-          <w:rPr>
-            <w:color w:val="0000EE"/>
-            <w:u w:val="single"/>
-          </w:rPr>
-          <w:t>Mark 8:34–35</w:t>
-        </w:r>
-      </w:hyperlink>
-      <w:r>
-        <w:rPr>
-          <w:lang w:val="en_US" w:bidi="en_US"/>
-        </w:rPr>
-        <w:t>). "Taking up one's cross" means being willing to give up everything for Jesus, even one's life. For example, Peter, Andrew, James, and John left their homes and jobs to follow Jesus (</w:t>
-      </w:r>
-      <w:hyperlink r:id="rId263">
-        <w:r>
-          <w:rPr>
-            <w:lang w:val="en_US" w:bidi="en_US"/>
-          </w:rPr>
-          <w:rPr>
-            <w:color w:val="0000EE"/>
-            <w:u w:val="single"/>
-          </w:rPr>
-          <w:t>Mark 1:16–20</w:t>
-        </w:r>
-      </w:hyperlink>
-      <w:r>
-        <w:rPr>
-          <w:lang w:val="en_US" w:bidi="en_US"/>
-        </w:rPr>
-        <w:t>). A rich man had to sell everything and give the money to the poor to stop being selfish (</w:t>
-      </w:r>
+        <w:t>Some people find it very challenging to follow Jesus, but God offers help through his grace (</w:t>
+      </w:r>
+      <w:hyperlink r:id="rId266">
+        <w:r>
+          <w:rPr>
+            <w:lang w:val="en_US" w:bidi="en_US"/>
+          </w:rPr>
+          <w:rPr>
+            <w:color w:val="0000EE"/>
+            <w:u w:val="single"/>
+          </w:rPr>
+          <w:t xml:space="preserve">Mark 10:17–25, </w:t>
+        </w:r>
+      </w:hyperlink>
       <w:hyperlink r:id="rId267">
         <w:r>
           <w:rPr>
@@ -7398,14 +7254,50 @@
             <w:color w:val="0000EE"/>
             <w:u w:val="single"/>
           </w:rPr>
-          <w:t>Mark 10:21</w:t>
-        </w:r>
-      </w:hyperlink>
-      <w:r>
-        <w:rPr>
-          <w:lang w:val="en_US" w:bidi="en_US"/>
-        </w:rPr>
-        <w:t xml:space="preserve">). </w:t>
+          <w:t>27</w:t>
+        </w:r>
+      </w:hyperlink>
+      <w:r>
+        <w:rPr>
+          <w:lang w:val="en_US" w:bidi="en_US"/>
+        </w:rPr>
+        <w:t>). Others find it easy to respond to the invitation (</w:t>
+      </w:r>
+      <w:hyperlink r:id="rId264">
+        <w:r>
+          <w:rPr>
+            <w:lang w:val="en_US" w:bidi="en_US"/>
+          </w:rPr>
+          <w:rPr>
+            <w:color w:val="0000EE"/>
+            <w:u w:val="single"/>
+          </w:rPr>
+          <w:t>Mark 2:14</w:t>
+        </w:r>
+      </w:hyperlink>
+      <w:r>
+        <w:rPr>
+          <w:lang w:val="en_US" w:bidi="en_US"/>
+        </w:rPr>
+        <w:t xml:space="preserve">; see also </w:t>
+      </w:r>
+      <w:hyperlink r:id="rId268">
+        <w:r>
+          <w:rPr>
+            <w:lang w:val="en_US" w:bidi="en_US"/>
+          </w:rPr>
+          <w:rPr>
+            <w:color w:val="0000EE"/>
+            <w:u w:val="single"/>
+          </w:rPr>
+          <w:t>Luke 7:36–50</w:t>
+        </w:r>
+      </w:hyperlink>
+      <w:r>
+        <w:rPr>
+          <w:lang w:val="en_US" w:bidi="en_US"/>
+        </w:rPr>
+        <w:t>).</w:t>
       </w:r>
     </w:p>
     <w:p>
@@ -7419,133 +7311,61 @@
         <w:rPr>
           <w:lang w:val="en_US" w:bidi="en_US"/>
         </w:rPr>
-        <w:t>Following Jesus also involves publicly acknowledging him and being faithful to his teachings (</w:t>
-      </w:r>
-      <w:hyperlink r:id="rId273">
-        <w:r>
-          <w:rPr>
-            <w:lang w:val="en_US" w:bidi="en_US"/>
-          </w:rPr>
-          <w:rPr>
-            <w:color w:val="0000EE"/>
-            <w:u w:val="single"/>
-          </w:rPr>
-          <w:t>Mark 8:38</w:t>
-        </w:r>
-      </w:hyperlink>
-      <w:r>
-        <w:rPr>
-          <w:lang w:val="en_US" w:bidi="en_US"/>
-        </w:rPr>
-        <w:t xml:space="preserve">; compare </w:t>
-      </w:r>
-      <w:hyperlink r:id="rId274">
-        <w:r>
-          <w:rPr>
-            <w:lang w:val="en_US" w:bidi="en_US"/>
-          </w:rPr>
-          <w:rPr>
-            <w:color w:val="0000EE"/>
-            <w:u w:val="single"/>
-          </w:rPr>
-          <w:t>Romans 10:9</w:t>
-        </w:r>
-      </w:hyperlink>
-      <w:r>
-        <w:rPr>
-          <w:lang w:val="en_US" w:bidi="en_US"/>
-        </w:rPr>
-        <w:t>). It means removing anything that stops you from following Jesus, no matter how difficult (</w:t>
-      </w:r>
-      <w:hyperlink r:id="rId275">
-        <w:r>
-          <w:rPr>
-            <w:lang w:val="en_US" w:bidi="en_US"/>
-          </w:rPr>
-          <w:rPr>
-            <w:color w:val="0000EE"/>
-            <w:u w:val="single"/>
-          </w:rPr>
-          <w:t>Mark 9:43–48</w:t>
-        </w:r>
-      </w:hyperlink>
-      <w:r>
-        <w:rPr>
-          <w:lang w:val="en_US" w:bidi="en_US"/>
-        </w:rPr>
-        <w:t>). It involves trusting Jesus completely and refusing to sin (</w:t>
-      </w:r>
-      <w:hyperlink r:id="rId276">
-        <w:r>
-          <w:rPr>
-            <w:lang w:val="en_US" w:bidi="en_US"/>
-          </w:rPr>
-          <w:rPr>
-            <w:color w:val="0000EE"/>
-            <w:u w:val="single"/>
-          </w:rPr>
-          <w:t>Mark 1:15</w:t>
-        </w:r>
-      </w:hyperlink>
-      <w:r>
-        <w:rPr>
-          <w:lang w:val="en_US" w:bidi="en_US"/>
-        </w:rPr>
-        <w:t xml:space="preserve">; </w:t>
-      </w:r>
-      <w:hyperlink r:id="rId277">
-        <w:r>
-          <w:rPr>
-            <w:lang w:val="en_US" w:bidi="en_US"/>
-          </w:rPr>
-          <w:rPr>
-            <w:color w:val="0000EE"/>
-            <w:u w:val="single"/>
-          </w:rPr>
-          <w:t>6:12</w:t>
-        </w:r>
-      </w:hyperlink>
-      <w:r>
-        <w:rPr>
-          <w:lang w:val="en_US" w:bidi="en_US"/>
-        </w:rPr>
-        <w:t>). It even requires being more loyal to Jesus than one's parents (</w:t>
-      </w:r>
-      <w:hyperlink r:id="rId278">
-        <w:r>
-          <w:rPr>
-            <w:lang w:val="en_US" w:bidi="en_US"/>
-          </w:rPr>
-          <w:rPr>
-            <w:color w:val="0000EE"/>
-            <w:u w:val="single"/>
-          </w:rPr>
-          <w:t>Matt 10:37</w:t>
-        </w:r>
-      </w:hyperlink>
-      <w:r>
-        <w:rPr>
-          <w:lang w:val="en_US" w:bidi="en_US"/>
-        </w:rPr>
-        <w:t xml:space="preserve">; </w:t>
-      </w:r>
-      <w:hyperlink r:id="rId279">
-        <w:r>
-          <w:rPr>
-            <w:lang w:val="en_US" w:bidi="en_US"/>
-          </w:rPr>
-          <w:rPr>
-            <w:color w:val="0000EE"/>
-            <w:u w:val="single"/>
-          </w:rPr>
-          <w:t>Luke 14:26</w:t>
-        </w:r>
-      </w:hyperlink>
-      <w:r>
-        <w:rPr>
-          <w:lang w:val="en_US" w:bidi="en_US"/>
-        </w:rPr>
-        <w:t>).</w:t>
+        <w:t>To "follow Jesus" means fully committing to leave behind selfish behaviors (</w:t>
+      </w:r>
+      <w:hyperlink r:id="rId269">
+        <w:r>
+          <w:rPr>
+            <w:lang w:val="en_US" w:bidi="en_US"/>
+          </w:rPr>
+          <w:rPr>
+            <w:color w:val="0000EE"/>
+            <w:u w:val="single"/>
+          </w:rPr>
+          <w:t>Mark 8:34–35</w:t>
+        </w:r>
+      </w:hyperlink>
+      <w:r>
+        <w:rPr>
+          <w:lang w:val="en_US" w:bidi="en_US"/>
+        </w:rPr>
+        <w:t>). "Taking up one's cross" means being willing to give up everything for Jesus, even one's life. For example, Peter, Andrew, James, and John left their homes and jobs to follow Jesus (</w:t>
+      </w:r>
+      <w:hyperlink r:id="rId263">
+        <w:r>
+          <w:rPr>
+            <w:lang w:val="en_US" w:bidi="en_US"/>
+          </w:rPr>
+          <w:rPr>
+            <w:color w:val="0000EE"/>
+            <w:u w:val="single"/>
+          </w:rPr>
+          <w:t>Mark 1:16–20</w:t>
+        </w:r>
+      </w:hyperlink>
+      <w:r>
+        <w:rPr>
+          <w:lang w:val="en_US" w:bidi="en_US"/>
+        </w:rPr>
+        <w:t>). A rich man had to sell everything and give the money to the poor to stop being selfish (</w:t>
+      </w:r>
+      <w:hyperlink r:id="rId270">
+        <w:r>
+          <w:rPr>
+            <w:lang w:val="en_US" w:bidi="en_US"/>
+          </w:rPr>
+          <w:rPr>
+            <w:color w:val="0000EE"/>
+            <w:u w:val="single"/>
+          </w:rPr>
+          <w:t>Mark 10:21</w:t>
+        </w:r>
+      </w:hyperlink>
+      <w:r>
+        <w:rPr>
+          <w:lang w:val="en_US" w:bidi="en_US"/>
+        </w:rPr>
+        <w:t xml:space="preserve">). </w:t>
       </w:r>
     </w:p>
     <w:p>
@@ -7559,324 +7379,126 @@
         <w:rPr>
           <w:lang w:val="en_US" w:bidi="en_US"/>
         </w:rPr>
-        <w:t>Jesus clearly told his disciples to share his message (</w:t>
-      </w:r>
-      <w:hyperlink r:id="rId280">
-        <w:r>
-          <w:rPr>
-            <w:lang w:val="en_US" w:bidi="en_US"/>
-          </w:rPr>
-          <w:rPr>
-            <w:color w:val="0000EE"/>
-            <w:u w:val="single"/>
-          </w:rPr>
-          <w:t>Matthew 28:18–20</w:t>
-        </w:r>
-      </w:hyperlink>
-      <w:r>
-        <w:rPr>
-          <w:lang w:val="en_US" w:bidi="en_US"/>
-        </w:rPr>
-        <w:t xml:space="preserve">; </w:t>
-      </w:r>
-      <w:hyperlink r:id="rId281">
-        <w:r>
-          <w:rPr>
-            <w:lang w:val="en_US" w:bidi="en_US"/>
-          </w:rPr>
-          <w:rPr>
-            <w:color w:val="0000EE"/>
-            <w:u w:val="single"/>
-          </w:rPr>
-          <w:t>Luke 24:47–49</w:t>
-        </w:r>
-      </w:hyperlink>
-      <w:r>
-        <w:rPr>
-          <w:lang w:val="en_US" w:bidi="en_US"/>
-        </w:rPr>
-        <w:t xml:space="preserve">; </w:t>
-      </w:r>
-      <w:hyperlink r:id="rId282">
-        <w:r>
-          <w:rPr>
-            <w:lang w:val="en_US" w:bidi="en_US"/>
-          </w:rPr>
-          <w:rPr>
-            <w:color w:val="0000EE"/>
-            <w:u w:val="single"/>
-          </w:rPr>
-          <w:t>Acts 1:8</w:t>
-        </w:r>
-      </w:hyperlink>
-      <w:r>
-        <w:rPr>
-          <w:lang w:val="en_US" w:bidi="en_US"/>
-        </w:rPr>
-        <w:t xml:space="preserve">). Throughout the New Testament, we see that Jesus' followers told people about the good news wherever they went. This led many more people to become followers of Jesus (see </w:t>
-      </w:r>
-      <w:hyperlink r:id="rId283">
-        <w:r>
-          <w:rPr>
-            <w:lang w:val="en_US" w:bidi="en_US"/>
-          </w:rPr>
-          <w:rPr>
-            <w:color w:val="0000EE"/>
-            <w:u w:val="single"/>
-          </w:rPr>
-          <w:t>Acts 2:14–41</w:t>
-        </w:r>
-      </w:hyperlink>
-      <w:r>
-        <w:rPr>
-          <w:lang w:val="en_US" w:bidi="en_US"/>
-        </w:rPr>
-        <w:t xml:space="preserve">; </w:t>
-      </w:r>
-      <w:hyperlink r:id="rId284">
-        <w:r>
-          <w:rPr>
-            <w:lang w:val="en_US" w:bidi="en_US"/>
-          </w:rPr>
-          <w:rPr>
-            <w:color w:val="0000EE"/>
-            <w:u w:val="single"/>
-          </w:rPr>
-          <w:t>3:12–26</w:t>
-        </w:r>
-      </w:hyperlink>
-      <w:r>
-        <w:rPr>
-          <w:lang w:val="en_US" w:bidi="en_US"/>
-        </w:rPr>
-        <w:t xml:space="preserve">; </w:t>
-      </w:r>
-      <w:hyperlink r:id="rId285">
-        <w:r>
-          <w:rPr>
-            <w:lang w:val="en_US" w:bidi="en_US"/>
-          </w:rPr>
-          <w:rPr>
-            <w:color w:val="0000EE"/>
-            <w:u w:val="single"/>
-          </w:rPr>
-          <w:t>4:1–2</w:t>
-        </w:r>
-      </w:hyperlink>
-      <w:r>
-        <w:rPr>
-          <w:lang w:val="en_US" w:bidi="en_US"/>
-        </w:rPr>
-        <w:t xml:space="preserve">, </w:t>
-      </w:r>
-      <w:hyperlink r:id="rId286">
-        <w:r>
-          <w:rPr>
-            <w:lang w:val="en_US" w:bidi="en_US"/>
-          </w:rPr>
-          <w:rPr>
-            <w:color w:val="0000EE"/>
-            <w:u w:val="single"/>
-          </w:rPr>
-          <w:t>20</w:t>
-        </w:r>
-      </w:hyperlink>
-      <w:r>
-        <w:rPr>
-          <w:lang w:val="en_US" w:bidi="en_US"/>
-        </w:rPr>
-        <w:t xml:space="preserve">; </w:t>
-      </w:r>
-      <w:hyperlink r:id="rId287">
-        <w:r>
-          <w:rPr>
-            <w:lang w:val="en_US" w:bidi="en_US"/>
-          </w:rPr>
-          <w:rPr>
-            <w:color w:val="0000EE"/>
-            <w:u w:val="single"/>
-          </w:rPr>
-          <w:t>8:4</w:t>
-        </w:r>
-      </w:hyperlink>
-      <w:r>
-        <w:rPr>
-          <w:lang w:val="en_US" w:bidi="en_US"/>
-        </w:rPr>
-        <w:t xml:space="preserve">; </w:t>
-      </w:r>
-      <w:hyperlink r:id="rId288">
-        <w:r>
-          <w:rPr>
-            <w:lang w:val="en_US" w:bidi="en_US"/>
-          </w:rPr>
-          <w:rPr>
-            <w:color w:val="0000EE"/>
-            <w:u w:val="single"/>
-          </w:rPr>
-          <w:t>9:20</w:t>
-        </w:r>
-      </w:hyperlink>
-      <w:r>
-        <w:rPr>
-          <w:lang w:val="en_US" w:bidi="en_US"/>
-        </w:rPr>
-        <w:t xml:space="preserve">; </w:t>
-      </w:r>
-      <w:hyperlink r:id="rId289">
-        <w:r>
-          <w:rPr>
-            <w:lang w:val="en_US" w:bidi="en_US"/>
-          </w:rPr>
-          <w:rPr>
-            <w:color w:val="0000EE"/>
-            <w:u w:val="single"/>
-          </w:rPr>
-          <w:t>11:19–26</w:t>
-        </w:r>
-      </w:hyperlink>
-      <w:r>
-        <w:rPr>
-          <w:lang w:val="en_US" w:bidi="en_US"/>
-        </w:rPr>
-        <w:t xml:space="preserve">; </w:t>
-      </w:r>
-      <w:hyperlink r:id="rId290">
-        <w:r>
-          <w:rPr>
-            <w:lang w:val="en_US" w:bidi="en_US"/>
-          </w:rPr>
-          <w:rPr>
-            <w:color w:val="0000EE"/>
-            <w:u w:val="single"/>
-          </w:rPr>
-          <w:t>13:1–3</w:t>
-        </w:r>
-      </w:hyperlink>
-      <w:r>
-        <w:rPr>
-          <w:lang w:val="en_US" w:bidi="en_US"/>
-        </w:rPr>
-        <w:t xml:space="preserve">; </w:t>
-      </w:r>
-      <w:hyperlink r:id="rId291">
-        <w:r>
-          <w:rPr>
-            <w:lang w:val="en_US" w:bidi="en_US"/>
-          </w:rPr>
-          <w:rPr>
-            <w:color w:val="0000EE"/>
-            <w:u w:val="single"/>
-          </w:rPr>
-          <w:t>Romans 1:1–16</w:t>
-        </w:r>
-      </w:hyperlink>
-      <w:r>
-        <w:rPr>
-          <w:lang w:val="en_US" w:bidi="en_US"/>
-        </w:rPr>
-        <w:t xml:space="preserve">; </w:t>
-      </w:r>
-      <w:hyperlink r:id="rId292">
-        <w:r>
-          <w:rPr>
-            <w:lang w:val="en_US" w:bidi="en_US"/>
-          </w:rPr>
-          <w:rPr>
-            <w:color w:val="0000EE"/>
-            <w:u w:val="single"/>
-          </w:rPr>
-          <w:t>10:14–15</w:t>
-        </w:r>
-      </w:hyperlink>
-      <w:r>
-        <w:rPr>
-          <w:lang w:val="en_US" w:bidi="en_US"/>
-        </w:rPr>
-        <w:t xml:space="preserve">; </w:t>
-      </w:r>
-      <w:hyperlink r:id="rId293">
-        <w:r>
-          <w:rPr>
-            <w:lang w:val="en_US" w:bidi="en_US"/>
-          </w:rPr>
-          <w:rPr>
-            <w:color w:val="0000EE"/>
-            <w:u w:val="single"/>
-          </w:rPr>
-          <w:t>15:18–21</w:t>
-        </w:r>
-      </w:hyperlink>
-      <w:r>
-        <w:rPr>
-          <w:lang w:val="en_US" w:bidi="en_US"/>
-        </w:rPr>
-        <w:t xml:space="preserve">; </w:t>
-      </w:r>
-      <w:hyperlink r:id="rId294">
-        <w:r>
-          <w:rPr>
-            <w:lang w:val="en_US" w:bidi="en_US"/>
-          </w:rPr>
-          <w:rPr>
-            <w:color w:val="0000EE"/>
-            <w:u w:val="single"/>
-          </w:rPr>
-          <w:t>1 Corinthians 9:16</w:t>
-        </w:r>
-      </w:hyperlink>
-      <w:r>
-        <w:rPr>
-          <w:lang w:val="en_US" w:bidi="en_US"/>
-        </w:rPr>
-        <w:t xml:space="preserve">; </w:t>
-      </w:r>
-      <w:hyperlink r:id="rId295">
-        <w:r>
-          <w:rPr>
-            <w:lang w:val="en_US" w:bidi="en_US"/>
-          </w:rPr>
-          <w:rPr>
-            <w:color w:val="0000EE"/>
-            <w:u w:val="single"/>
-          </w:rPr>
-          <w:t>Colossians 1:23</w:t>
-        </w:r>
-      </w:hyperlink>
-      <w:r>
-        <w:rPr>
-          <w:lang w:val="en_US" w:bidi="en_US"/>
-        </w:rPr>
-        <w:t xml:space="preserve">; </w:t>
-      </w:r>
-      <w:hyperlink r:id="rId296">
-        <w:r>
-          <w:rPr>
-            <w:lang w:val="en_US" w:bidi="en_US"/>
-          </w:rPr>
-          <w:rPr>
-            <w:color w:val="0000EE"/>
-            <w:u w:val="single"/>
-          </w:rPr>
-          <w:t>1 Thessalonians 2:9</w:t>
-        </w:r>
-      </w:hyperlink>
-      <w:r>
-        <w:rPr>
-          <w:lang w:val="en_US" w:bidi="en_US"/>
-        </w:rPr>
-        <w:t xml:space="preserve">; </w:t>
-      </w:r>
-      <w:hyperlink r:id="rId297">
-        <w:r>
-          <w:rPr>
-            <w:lang w:val="en_US" w:bidi="en_US"/>
-          </w:rPr>
-          <w:rPr>
-            <w:color w:val="0000EE"/>
-            <w:u w:val="single"/>
-          </w:rPr>
-          <w:t>2 Timothy 4:2</w:t>
+        <w:t>Following Jesus also involves publicly acknowledging him and being faithful to his teachings (</w:t>
+      </w:r>
+      <w:hyperlink r:id="rId271">
+        <w:r>
+          <w:rPr>
+            <w:lang w:val="en_US" w:bidi="en_US"/>
+          </w:rPr>
+          <w:rPr>
+            <w:color w:val="0000EE"/>
+            <w:u w:val="single"/>
+          </w:rPr>
+          <w:t>Mark 8:38</w:t>
+        </w:r>
+      </w:hyperlink>
+      <w:r>
+        <w:rPr>
+          <w:lang w:val="en_US" w:bidi="en_US"/>
+        </w:rPr>
+        <w:t xml:space="preserve">; compare </w:t>
+      </w:r>
+      <w:hyperlink r:id="rId272">
+        <w:r>
+          <w:rPr>
+            <w:lang w:val="en_US" w:bidi="en_US"/>
+          </w:rPr>
+          <w:rPr>
+            <w:color w:val="0000EE"/>
+            <w:u w:val="single"/>
+          </w:rPr>
+          <w:t>Romans 10:9</w:t>
+        </w:r>
+      </w:hyperlink>
+      <w:r>
+        <w:rPr>
+          <w:lang w:val="en_US" w:bidi="en_US"/>
+        </w:rPr>
+        <w:t>). It means removing anything that stops you from following Jesus, no matter how difficult (</w:t>
+      </w:r>
+      <w:hyperlink r:id="rId273">
+        <w:r>
+          <w:rPr>
+            <w:lang w:val="en_US" w:bidi="en_US"/>
+          </w:rPr>
+          <w:rPr>
+            <w:color w:val="0000EE"/>
+            <w:u w:val="single"/>
+          </w:rPr>
+          <w:t>Mark 9:43–48</w:t>
+        </w:r>
+      </w:hyperlink>
+      <w:r>
+        <w:rPr>
+          <w:lang w:val="en_US" w:bidi="en_US"/>
+        </w:rPr>
+        <w:t>). It involves trusting Jesus completely and refusing to sin (</w:t>
+      </w:r>
+      <w:hyperlink r:id="rId274">
+        <w:r>
+          <w:rPr>
+            <w:lang w:val="en_US" w:bidi="en_US"/>
+          </w:rPr>
+          <w:rPr>
+            <w:color w:val="0000EE"/>
+            <w:u w:val="single"/>
+          </w:rPr>
+          <w:t>Mark 1:15</w:t>
+        </w:r>
+      </w:hyperlink>
+      <w:r>
+        <w:rPr>
+          <w:lang w:val="en_US" w:bidi="en_US"/>
+        </w:rPr>
+        <w:t xml:space="preserve">; </w:t>
+      </w:r>
+      <w:hyperlink r:id="rId275">
+        <w:r>
+          <w:rPr>
+            <w:lang w:val="en_US" w:bidi="en_US"/>
+          </w:rPr>
+          <w:rPr>
+            <w:color w:val="0000EE"/>
+            <w:u w:val="single"/>
+          </w:rPr>
+          <w:t>6:12</w:t>
+        </w:r>
+      </w:hyperlink>
+      <w:r>
+        <w:rPr>
+          <w:lang w:val="en_US" w:bidi="en_US"/>
+        </w:rPr>
+        <w:t>). It even requires being more loyal to Jesus than one's parents (</w:t>
+      </w:r>
+      <w:hyperlink r:id="rId276">
+        <w:r>
+          <w:rPr>
+            <w:lang w:val="en_US" w:bidi="en_US"/>
+          </w:rPr>
+          <w:rPr>
+            <w:color w:val="0000EE"/>
+            <w:u w:val="single"/>
+          </w:rPr>
+          <w:t>Matt 10:37</w:t>
+        </w:r>
+      </w:hyperlink>
+      <w:r>
+        <w:rPr>
+          <w:lang w:val="en_US" w:bidi="en_US"/>
+        </w:rPr>
+        <w:t xml:space="preserve">; </w:t>
+      </w:r>
+      <w:hyperlink r:id="rId277">
+        <w:r>
+          <w:rPr>
+            <w:lang w:val="en_US" w:bidi="en_US"/>
+          </w:rPr>
+          <w:rPr>
+            <w:color w:val="0000EE"/>
+            <w:u w:val="single"/>
+          </w:rPr>
+          <w:t>Luke 14:26</w:t>
         </w:r>
       </w:hyperlink>
       <w:r>
@@ -7897,6 +7519,344 @@
         <w:rPr>
           <w:lang w:val="en_US" w:bidi="en_US"/>
         </w:rPr>
+        <w:t>Jesus clearly told his disciples to share his message (</w:t>
+      </w:r>
+      <w:hyperlink r:id="rId278">
+        <w:r>
+          <w:rPr>
+            <w:lang w:val="en_US" w:bidi="en_US"/>
+          </w:rPr>
+          <w:rPr>
+            <w:color w:val="0000EE"/>
+            <w:u w:val="single"/>
+          </w:rPr>
+          <w:t>Matthew 28:18–20</w:t>
+        </w:r>
+      </w:hyperlink>
+      <w:r>
+        <w:rPr>
+          <w:lang w:val="en_US" w:bidi="en_US"/>
+        </w:rPr>
+        <w:t xml:space="preserve">; </w:t>
+      </w:r>
+      <w:hyperlink r:id="rId279">
+        <w:r>
+          <w:rPr>
+            <w:lang w:val="en_US" w:bidi="en_US"/>
+          </w:rPr>
+          <w:rPr>
+            <w:color w:val="0000EE"/>
+            <w:u w:val="single"/>
+          </w:rPr>
+          <w:t>Luke 24:47–49</w:t>
+        </w:r>
+      </w:hyperlink>
+      <w:r>
+        <w:rPr>
+          <w:lang w:val="en_US" w:bidi="en_US"/>
+        </w:rPr>
+        <w:t xml:space="preserve">; </w:t>
+      </w:r>
+      <w:hyperlink r:id="rId280">
+        <w:r>
+          <w:rPr>
+            <w:lang w:val="en_US" w:bidi="en_US"/>
+          </w:rPr>
+          <w:rPr>
+            <w:color w:val="0000EE"/>
+            <w:u w:val="single"/>
+          </w:rPr>
+          <w:t>Acts 1:8</w:t>
+        </w:r>
+      </w:hyperlink>
+      <w:r>
+        <w:rPr>
+          <w:lang w:val="en_US" w:bidi="en_US"/>
+        </w:rPr>
+        <w:t xml:space="preserve">). Throughout the New Testament, we see that the followers of Jesus told people about the good news wherever they went. This led many more people to become followers of Jesus (see </w:t>
+      </w:r>
+      <w:hyperlink r:id="rId281">
+        <w:r>
+          <w:rPr>
+            <w:lang w:val="en_US" w:bidi="en_US"/>
+          </w:rPr>
+          <w:rPr>
+            <w:color w:val="0000EE"/>
+            <w:u w:val="single"/>
+          </w:rPr>
+          <w:t>Acts 2:14–41</w:t>
+        </w:r>
+      </w:hyperlink>
+      <w:r>
+        <w:rPr>
+          <w:lang w:val="en_US" w:bidi="en_US"/>
+        </w:rPr>
+        <w:t xml:space="preserve">; </w:t>
+      </w:r>
+      <w:hyperlink r:id="rId282">
+        <w:r>
+          <w:rPr>
+            <w:lang w:val="en_US" w:bidi="en_US"/>
+          </w:rPr>
+          <w:rPr>
+            <w:color w:val="0000EE"/>
+            <w:u w:val="single"/>
+          </w:rPr>
+          <w:t>3:12–26</w:t>
+        </w:r>
+      </w:hyperlink>
+      <w:r>
+        <w:rPr>
+          <w:lang w:val="en_US" w:bidi="en_US"/>
+        </w:rPr>
+        <w:t xml:space="preserve">; </w:t>
+      </w:r>
+      <w:hyperlink r:id="rId283">
+        <w:r>
+          <w:rPr>
+            <w:lang w:val="en_US" w:bidi="en_US"/>
+          </w:rPr>
+          <w:rPr>
+            <w:color w:val="0000EE"/>
+            <w:u w:val="single"/>
+          </w:rPr>
+          <w:t>4:1–2</w:t>
+        </w:r>
+      </w:hyperlink>
+      <w:r>
+        <w:rPr>
+          <w:lang w:val="en_US" w:bidi="en_US"/>
+        </w:rPr>
+        <w:t xml:space="preserve">, </w:t>
+      </w:r>
+      <w:hyperlink r:id="rId284">
+        <w:r>
+          <w:rPr>
+            <w:lang w:val="en_US" w:bidi="en_US"/>
+          </w:rPr>
+          <w:rPr>
+            <w:color w:val="0000EE"/>
+            <w:u w:val="single"/>
+          </w:rPr>
+          <w:t>20</w:t>
+        </w:r>
+      </w:hyperlink>
+      <w:r>
+        <w:rPr>
+          <w:lang w:val="en_US" w:bidi="en_US"/>
+        </w:rPr>
+        <w:t xml:space="preserve">; </w:t>
+      </w:r>
+      <w:hyperlink r:id="rId285">
+        <w:r>
+          <w:rPr>
+            <w:lang w:val="en_US" w:bidi="en_US"/>
+          </w:rPr>
+          <w:rPr>
+            <w:color w:val="0000EE"/>
+            <w:u w:val="single"/>
+          </w:rPr>
+          <w:t>8:4</w:t>
+        </w:r>
+      </w:hyperlink>
+      <w:r>
+        <w:rPr>
+          <w:lang w:val="en_US" w:bidi="en_US"/>
+        </w:rPr>
+        <w:t xml:space="preserve">; </w:t>
+      </w:r>
+      <w:hyperlink r:id="rId286">
+        <w:r>
+          <w:rPr>
+            <w:lang w:val="en_US" w:bidi="en_US"/>
+          </w:rPr>
+          <w:rPr>
+            <w:color w:val="0000EE"/>
+            <w:u w:val="single"/>
+          </w:rPr>
+          <w:t>9:20</w:t>
+        </w:r>
+      </w:hyperlink>
+      <w:r>
+        <w:rPr>
+          <w:lang w:val="en_US" w:bidi="en_US"/>
+        </w:rPr>
+        <w:t xml:space="preserve">; </w:t>
+      </w:r>
+      <w:hyperlink r:id="rId287">
+        <w:r>
+          <w:rPr>
+            <w:lang w:val="en_US" w:bidi="en_US"/>
+          </w:rPr>
+          <w:rPr>
+            <w:color w:val="0000EE"/>
+            <w:u w:val="single"/>
+          </w:rPr>
+          <w:t>11:19–26</w:t>
+        </w:r>
+      </w:hyperlink>
+      <w:r>
+        <w:rPr>
+          <w:lang w:val="en_US" w:bidi="en_US"/>
+        </w:rPr>
+        <w:t xml:space="preserve">; </w:t>
+      </w:r>
+      <w:hyperlink r:id="rId288">
+        <w:r>
+          <w:rPr>
+            <w:lang w:val="en_US" w:bidi="en_US"/>
+          </w:rPr>
+          <w:rPr>
+            <w:color w:val="0000EE"/>
+            <w:u w:val="single"/>
+          </w:rPr>
+          <w:t>13:1–3</w:t>
+        </w:r>
+      </w:hyperlink>
+      <w:r>
+        <w:rPr>
+          <w:lang w:val="en_US" w:bidi="en_US"/>
+        </w:rPr>
+        <w:t xml:space="preserve">; </w:t>
+      </w:r>
+      <w:hyperlink r:id="rId289">
+        <w:r>
+          <w:rPr>
+            <w:lang w:val="en_US" w:bidi="en_US"/>
+          </w:rPr>
+          <w:rPr>
+            <w:color w:val="0000EE"/>
+            <w:u w:val="single"/>
+          </w:rPr>
+          <w:t>Romans 1:1–16</w:t>
+        </w:r>
+      </w:hyperlink>
+      <w:r>
+        <w:rPr>
+          <w:lang w:val="en_US" w:bidi="en_US"/>
+        </w:rPr>
+        <w:t xml:space="preserve">; </w:t>
+      </w:r>
+      <w:hyperlink r:id="rId290">
+        <w:r>
+          <w:rPr>
+            <w:lang w:val="en_US" w:bidi="en_US"/>
+          </w:rPr>
+          <w:rPr>
+            <w:color w:val="0000EE"/>
+            <w:u w:val="single"/>
+          </w:rPr>
+          <w:t>10:14–15</w:t>
+        </w:r>
+      </w:hyperlink>
+      <w:r>
+        <w:rPr>
+          <w:lang w:val="en_US" w:bidi="en_US"/>
+        </w:rPr>
+        <w:t xml:space="preserve">; </w:t>
+      </w:r>
+      <w:hyperlink r:id="rId291">
+        <w:r>
+          <w:rPr>
+            <w:lang w:val="en_US" w:bidi="en_US"/>
+          </w:rPr>
+          <w:rPr>
+            <w:color w:val="0000EE"/>
+            <w:u w:val="single"/>
+          </w:rPr>
+          <w:t>15:18–21</w:t>
+        </w:r>
+      </w:hyperlink>
+      <w:r>
+        <w:rPr>
+          <w:lang w:val="en_US" w:bidi="en_US"/>
+        </w:rPr>
+        <w:t xml:space="preserve">; </w:t>
+      </w:r>
+      <w:hyperlink r:id="rId292">
+        <w:r>
+          <w:rPr>
+            <w:lang w:val="en_US" w:bidi="en_US"/>
+          </w:rPr>
+          <w:rPr>
+            <w:color w:val="0000EE"/>
+            <w:u w:val="single"/>
+          </w:rPr>
+          <w:t>1 Corinthians 9:16</w:t>
+        </w:r>
+      </w:hyperlink>
+      <w:r>
+        <w:rPr>
+          <w:lang w:val="en_US" w:bidi="en_US"/>
+        </w:rPr>
+        <w:t xml:space="preserve">; </w:t>
+      </w:r>
+      <w:hyperlink r:id="rId293">
+        <w:r>
+          <w:rPr>
+            <w:lang w:val="en_US" w:bidi="en_US"/>
+          </w:rPr>
+          <w:rPr>
+            <w:color w:val="0000EE"/>
+            <w:u w:val="single"/>
+          </w:rPr>
+          <w:t>Colossians 1:23</w:t>
+        </w:r>
+      </w:hyperlink>
+      <w:r>
+        <w:rPr>
+          <w:lang w:val="en_US" w:bidi="en_US"/>
+        </w:rPr>
+        <w:t xml:space="preserve">; </w:t>
+      </w:r>
+      <w:hyperlink r:id="rId294">
+        <w:r>
+          <w:rPr>
+            <w:lang w:val="en_US" w:bidi="en_US"/>
+          </w:rPr>
+          <w:rPr>
+            <w:color w:val="0000EE"/>
+            <w:u w:val="single"/>
+          </w:rPr>
+          <w:t>1 Thessalonians 2:9</w:t>
+        </w:r>
+      </w:hyperlink>
+      <w:r>
+        <w:rPr>
+          <w:lang w:val="en_US" w:bidi="en_US"/>
+        </w:rPr>
+        <w:t xml:space="preserve">; </w:t>
+      </w:r>
+      <w:hyperlink r:id="rId295">
+        <w:r>
+          <w:rPr>
+            <w:lang w:val="en_US" w:bidi="en_US"/>
+          </w:rPr>
+          <w:rPr>
+            <w:color w:val="0000EE"/>
+            <w:u w:val="single"/>
+          </w:rPr>
+          <w:t>2 Timothy 4:2</w:t>
+        </w:r>
+      </w:hyperlink>
+      <w:r>
+        <w:rPr>
+          <w:lang w:val="en_US" w:bidi="en_US"/>
+        </w:rPr>
+        <w:t>).</w:t>
+      </w:r>
+    </w:p>
+    <w:p>
+      <w:pPr/>
+      <w:r>
+        <w:rPr>
+          <w:lang w:val="en_US" w:bidi="en_US"/>
+        </w:rPr>
+      </w:r>
+      <w:r>
+        <w:rPr>
+          <w:lang w:val="en_US" w:bidi="en_US"/>
+        </w:rPr>
         <w:t>Following Jesus brings both responsibilities and rewards. Those who follow him receive:</w:t>
       </w:r>
     </w:p>
@@ -7915,9 +7875,9 @@
         <w:rPr>
           <w:lang w:val="en_US" w:bidi="en_US"/>
         </w:rPr>
-        <w:t>A place in God's kingdom (</w:t>
-      </w:r>
-      <w:hyperlink r:id="rId275">
+        <w:t>a place in God's kingdom (</w:t>
+      </w:r>
+      <w:hyperlink r:id="rId273">
         <w:r>
           <w:rPr>
             <w:lang w:val="en_US" w:bidi="en_US"/>
@@ -7935,7 +7895,7 @@
         </w:rPr>
         <w:t xml:space="preserve">; </w:t>
       </w:r>
-      <w:hyperlink r:id="rId298">
+      <w:hyperlink r:id="rId296">
         <w:r>
           <w:rPr>
             <w:lang w:val="en_US" w:bidi="en_US"/>
@@ -7951,7 +7911,7 @@
         <w:rPr>
           <w:lang w:val="en_US" w:bidi="en_US"/>
         </w:rPr>
-        <w:t xml:space="preserve">) </w:t>
+        <w:t>),</w:t>
       </w:r>
     </w:p>
     <w:p>
@@ -7969,7 +7929,43 @@
         <w:rPr>
           <w:lang w:val="en_US" w:bidi="en_US"/>
         </w:rPr>
-        <w:t>Forgiveness for their sins (</w:t>
+        <w:t>forgiveness for their sins (</w:t>
+      </w:r>
+      <w:hyperlink r:id="rId297">
+        <w:r>
+          <w:rPr>
+            <w:lang w:val="en_US" w:bidi="en_US"/>
+          </w:rPr>
+          <w:rPr>
+            <w:color w:val="0000EE"/>
+            <w:u w:val="single"/>
+          </w:rPr>
+          <w:t>Mark 2:10–11</w:t>
+        </w:r>
+      </w:hyperlink>
+      <w:r>
+        <w:rPr>
+          <w:lang w:val="en_US" w:bidi="en_US"/>
+        </w:rPr>
+        <w:t xml:space="preserve">; see also </w:t>
+      </w:r>
+      <w:hyperlink r:id="rId298">
+        <w:r>
+          <w:rPr>
+            <w:lang w:val="en_US" w:bidi="en_US"/>
+          </w:rPr>
+          <w:rPr>
+            <w:color w:val="0000EE"/>
+            <w:u w:val="single"/>
+          </w:rPr>
+          <w:t>3:28</w:t>
+        </w:r>
+      </w:hyperlink>
+      <w:r>
+        <w:rPr>
+          <w:lang w:val="en_US" w:bidi="en_US"/>
+        </w:rPr>
+        <w:t xml:space="preserve">; </w:t>
       </w:r>
       <w:hyperlink r:id="rId299">
         <w:r>
@@ -7980,42 +7976,6 @@
             <w:color w:val="0000EE"/>
             <w:u w:val="single"/>
           </w:rPr>
-          <w:t>Mark 2:10–11</w:t>
-        </w:r>
-      </w:hyperlink>
-      <w:r>
-        <w:rPr>
-          <w:lang w:val="en_US" w:bidi="en_US"/>
-        </w:rPr>
-        <w:t xml:space="preserve">; see also </w:t>
-      </w:r>
-      <w:hyperlink r:id="rId300">
-        <w:r>
-          <w:rPr>
-            <w:lang w:val="en_US" w:bidi="en_US"/>
-          </w:rPr>
-          <w:rPr>
-            <w:color w:val="0000EE"/>
-            <w:u w:val="single"/>
-          </w:rPr>
-          <w:t>3:28</w:t>
-        </w:r>
-      </w:hyperlink>
-      <w:r>
-        <w:rPr>
-          <w:lang w:val="en_US" w:bidi="en_US"/>
-        </w:rPr>
-        <w:t xml:space="preserve">; </w:t>
-      </w:r>
-      <w:hyperlink r:id="rId301">
-        <w:r>
-          <w:rPr>
-            <w:lang w:val="en_US" w:bidi="en_US"/>
-          </w:rPr>
-          <w:rPr>
-            <w:color w:val="0000EE"/>
-            <w:u w:val="single"/>
-          </w:rPr>
           <w:t>11:25</w:t>
         </w:r>
       </w:hyperlink>
@@ -8023,7 +7983,7 @@
         <w:rPr>
           <w:lang w:val="en_US" w:bidi="en_US"/>
         </w:rPr>
-        <w:t>)</w:t>
+        <w:t>),</w:t>
       </w:r>
     </w:p>
     <w:p>
@@ -8041,9 +8001,9 @@
         <w:rPr>
           <w:lang w:val="en_US" w:bidi="en_US"/>
         </w:rPr>
-        <w:t>A place in God's family (</w:t>
-      </w:r>
-      <w:hyperlink r:id="rId302">
+        <w:t>a place in God's family (</w:t>
+      </w:r>
+      <w:hyperlink r:id="rId300">
         <w:r>
           <w:rPr>
             <w:lang w:val="en_US" w:bidi="en_US"/>
@@ -8059,7 +8019,7 @@
         <w:rPr>
           <w:lang w:val="en_US" w:bidi="en_US"/>
         </w:rPr>
-        <w:t>)</w:t>
+        <w:t>),</w:t>
       </w:r>
     </w:p>
     <w:p>
@@ -8077,9 +8037,9 @@
         <w:rPr>
           <w:lang w:val="en_US" w:bidi="en_US"/>
         </w:rPr>
-        <w:t>Protection from God's judgment (</w:t>
-      </w:r>
-      <w:hyperlink r:id="rId303">
+        <w:t>protection from God's judgment (</w:t>
+      </w:r>
+      <w:hyperlink r:id="rId301">
         <w:r>
           <w:rPr>
             <w:lang w:val="en_US" w:bidi="en_US"/>
@@ -8097,7 +8057,7 @@
         </w:rPr>
         <w:t xml:space="preserve">; </w:t>
       </w:r>
-      <w:hyperlink r:id="rId304">
+      <w:hyperlink r:id="rId302">
         <w:r>
           <w:rPr>
             <w:lang w:val="en_US" w:bidi="en_US"/>
@@ -8113,7 +8073,7 @@
         <w:rPr>
           <w:lang w:val="en_US" w:bidi="en_US"/>
         </w:rPr>
-        <w:t>)</w:t>
+        <w:t>), and</w:t>
       </w:r>
     </w:p>
     <w:p>
@@ -8131,7 +8091,43 @@
         <w:rPr>
           <w:lang w:val="en_US" w:bidi="en_US"/>
         </w:rPr>
-        <w:t>Eternal life (</w:t>
+        <w:t>eternal life (</w:t>
+      </w:r>
+      <w:hyperlink r:id="rId303">
+        <w:r>
+          <w:rPr>
+            <w:lang w:val="en_US" w:bidi="en_US"/>
+          </w:rPr>
+          <w:rPr>
+            <w:color w:val="0000EE"/>
+            <w:u w:val="single"/>
+          </w:rPr>
+          <w:t>Mark 9:43</w:t>
+        </w:r>
+      </w:hyperlink>
+      <w:r>
+        <w:rPr>
+          <w:lang w:val="en_US" w:bidi="en_US"/>
+        </w:rPr>
+        <w:t xml:space="preserve">; </w:t>
+      </w:r>
+      <w:hyperlink r:id="rId304">
+        <w:r>
+          <w:rPr>
+            <w:lang w:val="en_US" w:bidi="en_US"/>
+          </w:rPr>
+          <w:rPr>
+            <w:color w:val="0000EE"/>
+            <w:u w:val="single"/>
+          </w:rPr>
+          <w:t>10:29–30</w:t>
+        </w:r>
+      </w:hyperlink>
+      <w:r>
+        <w:rPr>
+          <w:lang w:val="en_US" w:bidi="en_US"/>
+        </w:rPr>
+        <w:t xml:space="preserve">; </w:t>
       </w:r>
       <w:hyperlink r:id="rId305">
         <w:r>
@@ -8142,42 +8138,6 @@
             <w:color w:val="0000EE"/>
             <w:u w:val="single"/>
           </w:rPr>
-          <w:t>Mark 9:43</w:t>
-        </w:r>
-      </w:hyperlink>
-      <w:r>
-        <w:rPr>
-          <w:lang w:val="en_US" w:bidi="en_US"/>
-        </w:rPr>
-        <w:t xml:space="preserve">; </w:t>
-      </w:r>
-      <w:hyperlink r:id="rId306">
-        <w:r>
-          <w:rPr>
-            <w:lang w:val="en_US" w:bidi="en_US"/>
-          </w:rPr>
-          <w:rPr>
-            <w:color w:val="0000EE"/>
-            <w:u w:val="single"/>
-          </w:rPr>
-          <w:t>10:29–30</w:t>
-        </w:r>
-      </w:hyperlink>
-      <w:r>
-        <w:rPr>
-          <w:lang w:val="en_US" w:bidi="en_US"/>
-        </w:rPr>
-        <w:t xml:space="preserve">; </w:t>
-      </w:r>
-      <w:hyperlink r:id="rId307">
-        <w:r>
-          <w:rPr>
-            <w:lang w:val="en_US" w:bidi="en_US"/>
-          </w:rPr>
-          <w:rPr>
-            <w:color w:val="0000EE"/>
-            <w:u w:val="single"/>
-          </w:rPr>
           <w:t>1 John 5:11–12</w:t>
         </w:r>
       </w:hyperlink>
@@ -8185,7 +8145,7 @@
         <w:rPr>
           <w:lang w:val="en_US" w:bidi="en_US"/>
         </w:rPr>
-        <w:t>)</w:t>
+        <w:t>).</w:t>
       </w:r>
     </w:p>
     <w:p>
@@ -8210,6 +8170,60 @@
           <w:lang w:val="en_US" w:bidi="en_US"/>
         </w:rPr>
       </w:r>
+      <w:hyperlink r:id="rId306">
+        <w:r>
+          <w:rPr>
+            <w:lang w:val="en_US" w:bidi="en_US"/>
+          </w:rPr>
+          <w:rPr>
+            <w:color w:val="0000EE"/>
+            <w:u w:val="single"/>
+          </w:rPr>
+          <w:t>Hosea 6:3</w:t>
+        </w:r>
+      </w:hyperlink>
+      <w:r>
+        <w:rPr>
+          <w:lang w:val="en_US" w:bidi="en_US"/>
+        </w:rPr>
+        <w:t xml:space="preserve">; </w:t>
+      </w:r>
+      <w:hyperlink r:id="rId307">
+        <w:r>
+          <w:rPr>
+            <w:lang w:val="en_US" w:bidi="en_US"/>
+          </w:rPr>
+          <w:rPr>
+            <w:color w:val="0000EE"/>
+            <w:u w:val="single"/>
+          </w:rPr>
+          <w:t>Matthew 10:37–39</w:t>
+        </w:r>
+      </w:hyperlink>
+      <w:r>
+        <w:rPr>
+          <w:lang w:val="en_US" w:bidi="en_US"/>
+        </w:rPr>
+        <w:t xml:space="preserve">; </w:t>
+      </w:r>
+      <w:hyperlink r:id="rId278">
+        <w:r>
+          <w:rPr>
+            <w:lang w:val="en_US" w:bidi="en_US"/>
+          </w:rPr>
+          <w:rPr>
+            <w:color w:val="0000EE"/>
+            <w:u w:val="single"/>
+          </w:rPr>
+          <w:t>28:18–20</w:t>
+        </w:r>
+      </w:hyperlink>
+      <w:r>
+        <w:rPr>
+          <w:lang w:val="en_US" w:bidi="en_US"/>
+        </w:rPr>
+        <w:t xml:space="preserve">; </w:t>
+      </w:r>
       <w:hyperlink r:id="rId308">
         <w:r>
           <w:rPr>
@@ -8219,7 +8233,7 @@
             <w:color w:val="0000EE"/>
             <w:u w:val="single"/>
           </w:rPr>
-          <w:t>Hosea 6:3</w:t>
+          <w:t>Mark 1:15–20</w:t>
         </w:r>
       </w:hyperlink>
       <w:r>
@@ -8237,7 +8251,259 @@
             <w:color w:val="0000EE"/>
             <w:u w:val="single"/>
           </w:rPr>
-          <w:t>Matthew 10:37–39</w:t>
+          <w:t>2:14–15</w:t>
+        </w:r>
+      </w:hyperlink>
+      <w:r>
+        <w:rPr>
+          <w:lang w:val="en_US" w:bidi="en_US"/>
+        </w:rPr>
+        <w:t xml:space="preserve">; </w:t>
+      </w:r>
+      <w:hyperlink r:id="rId310">
+        <w:r>
+          <w:rPr>
+            <w:lang w:val="en_US" w:bidi="en_US"/>
+          </w:rPr>
+          <w:rPr>
+            <w:color w:val="0000EE"/>
+            <w:u w:val="single"/>
+          </w:rPr>
+          <w:t>3:13–15</w:t>
+        </w:r>
+      </w:hyperlink>
+      <w:r>
+        <w:rPr>
+          <w:lang w:val="en_US" w:bidi="en_US"/>
+        </w:rPr>
+        <w:t xml:space="preserve">; </w:t>
+      </w:r>
+      <w:hyperlink r:id="rId311">
+        <w:r>
+          <w:rPr>
+            <w:lang w:val="en_US" w:bidi="en_US"/>
+          </w:rPr>
+          <w:rPr>
+            <w:color w:val="0000EE"/>
+            <w:u w:val="single"/>
+          </w:rPr>
+          <w:t>5:18–20</w:t>
+        </w:r>
+      </w:hyperlink>
+      <w:r>
+        <w:rPr>
+          <w:lang w:val="en_US" w:bidi="en_US"/>
+        </w:rPr>
+        <w:t xml:space="preserve">; </w:t>
+      </w:r>
+      <w:hyperlink r:id="rId312">
+        <w:r>
+          <w:rPr>
+            <w:lang w:val="en_US" w:bidi="en_US"/>
+          </w:rPr>
+          <w:rPr>
+            <w:color w:val="0000EE"/>
+            <w:u w:val="single"/>
+          </w:rPr>
+          <w:t>6:6–13</w:t>
+        </w:r>
+      </w:hyperlink>
+      <w:r>
+        <w:rPr>
+          <w:lang w:val="en_US" w:bidi="en_US"/>
+        </w:rPr>
+        <w:t xml:space="preserve">, </w:t>
+      </w:r>
+      <w:hyperlink r:id="rId313">
+        <w:r>
+          <w:rPr>
+            <w:lang w:val="en_US" w:bidi="en_US"/>
+          </w:rPr>
+          <w:rPr>
+            <w:color w:val="0000EE"/>
+            <w:u w:val="single"/>
+          </w:rPr>
+          <w:t>30–32</w:t>
+        </w:r>
+      </w:hyperlink>
+      <w:r>
+        <w:rPr>
+          <w:lang w:val="en_US" w:bidi="en_US"/>
+        </w:rPr>
+        <w:t xml:space="preserve">; </w:t>
+      </w:r>
+      <w:hyperlink r:id="rId314">
+        <w:r>
+          <w:rPr>
+            <w:lang w:val="en_US" w:bidi="en_US"/>
+          </w:rPr>
+          <w:rPr>
+            <w:color w:val="0000EE"/>
+            <w:u w:val="single"/>
+          </w:rPr>
+          <w:t>8:34–38</w:t>
+        </w:r>
+      </w:hyperlink>
+      <w:r>
+        <w:rPr>
+          <w:lang w:val="en_US" w:bidi="en_US"/>
+        </w:rPr>
+        <w:t xml:space="preserve">; </w:t>
+      </w:r>
+      <w:hyperlink r:id="rId315">
+        <w:r>
+          <w:rPr>
+            <w:lang w:val="en_US" w:bidi="en_US"/>
+          </w:rPr>
+          <w:rPr>
+            <w:color w:val="0000EE"/>
+            <w:u w:val="single"/>
+          </w:rPr>
+          <w:t>9:38–50</w:t>
+        </w:r>
+      </w:hyperlink>
+      <w:r>
+        <w:rPr>
+          <w:lang w:val="en_US" w:bidi="en_US"/>
+        </w:rPr>
+        <w:t xml:space="preserve">; </w:t>
+      </w:r>
+      <w:hyperlink r:id="rId316">
+        <w:r>
+          <w:rPr>
+            <w:lang w:val="en_US" w:bidi="en_US"/>
+          </w:rPr>
+          <w:rPr>
+            <w:color w:val="0000EE"/>
+            <w:u w:val="single"/>
+          </w:rPr>
+          <w:t>10:17–31</w:t>
+        </w:r>
+      </w:hyperlink>
+      <w:r>
+        <w:rPr>
+          <w:lang w:val="en_US" w:bidi="en_US"/>
+        </w:rPr>
+        <w:t xml:space="preserve">; </w:t>
+      </w:r>
+      <w:hyperlink r:id="rId317">
+        <w:r>
+          <w:rPr>
+            <w:lang w:val="en_US" w:bidi="en_US"/>
+          </w:rPr>
+          <w:rPr>
+            <w:color w:val="0000EE"/>
+            <w:u w:val="single"/>
+          </w:rPr>
+          <w:t>11:22–25</w:t>
+        </w:r>
+      </w:hyperlink>
+      <w:r>
+        <w:rPr>
+          <w:lang w:val="en_US" w:bidi="en_US"/>
+        </w:rPr>
+        <w:t xml:space="preserve">; </w:t>
+      </w:r>
+      <w:hyperlink r:id="rId318">
+        <w:r>
+          <w:rPr>
+            <w:lang w:val="en_US" w:bidi="en_US"/>
+          </w:rPr>
+          <w:rPr>
+            <w:color w:val="0000EE"/>
+            <w:u w:val="single"/>
+          </w:rPr>
+          <w:t>13:9–13</w:t>
+        </w:r>
+      </w:hyperlink>
+      <w:r>
+        <w:rPr>
+          <w:lang w:val="en_US" w:bidi="en_US"/>
+        </w:rPr>
+        <w:t xml:space="preserve">; </w:t>
+      </w:r>
+      <w:hyperlink r:id="rId319">
+        <w:r>
+          <w:rPr>
+            <w:lang w:val="en_US" w:bidi="en_US"/>
+          </w:rPr>
+          <w:rPr>
+            <w:color w:val="0000EE"/>
+            <w:u w:val="single"/>
+          </w:rPr>
+          <w:t>Luke 14:25–35</w:t>
+        </w:r>
+      </w:hyperlink>
+      <w:r>
+        <w:rPr>
+          <w:lang w:val="en_US" w:bidi="en_US"/>
+        </w:rPr>
+        <w:t xml:space="preserve">; </w:t>
+      </w:r>
+      <w:hyperlink r:id="rId279">
+        <w:r>
+          <w:rPr>
+            <w:lang w:val="en_US" w:bidi="en_US"/>
+          </w:rPr>
+          <w:rPr>
+            <w:color w:val="0000EE"/>
+            <w:u w:val="single"/>
+          </w:rPr>
+          <w:t>24:47–49</w:t>
+        </w:r>
+      </w:hyperlink>
+      <w:r>
+        <w:rPr>
+          <w:lang w:val="en_US" w:bidi="en_US"/>
+        </w:rPr>
+        <w:t xml:space="preserve">; </w:t>
+      </w:r>
+      <w:hyperlink r:id="rId320">
+        <w:r>
+          <w:rPr>
+            <w:lang w:val="en_US" w:bidi="en_US"/>
+          </w:rPr>
+          <w:rPr>
+            <w:color w:val="0000EE"/>
+            <w:u w:val="single"/>
+          </w:rPr>
+          <w:t>John 8:12</w:t>
+        </w:r>
+      </w:hyperlink>
+      <w:r>
+        <w:rPr>
+          <w:lang w:val="en_US" w:bidi="en_US"/>
+        </w:rPr>
+        <w:t xml:space="preserve">; </w:t>
+      </w:r>
+      <w:hyperlink r:id="rId321">
+        <w:r>
+          <w:rPr>
+            <w:lang w:val="en_US" w:bidi="en_US"/>
+          </w:rPr>
+          <w:rPr>
+            <w:color w:val="0000EE"/>
+            <w:u w:val="single"/>
+          </w:rPr>
+          <w:t>10:27</w:t>
+        </w:r>
+      </w:hyperlink>
+      <w:r>
+        <w:rPr>
+          <w:lang w:val="en_US" w:bidi="en_US"/>
+        </w:rPr>
+        <w:t xml:space="preserve">; </w:t>
+      </w:r>
+      <w:hyperlink r:id="rId322">
+        <w:r>
+          <w:rPr>
+            <w:lang w:val="en_US" w:bidi="en_US"/>
+          </w:rPr>
+          <w:rPr>
+            <w:color w:val="0000EE"/>
+            <w:u w:val="single"/>
+          </w:rPr>
+          <w:t>12:26</w:t>
         </w:r>
       </w:hyperlink>
       <w:r>
@@ -8255,259 +8521,7 @@
             <w:color w:val="0000EE"/>
             <w:u w:val="single"/>
           </w:rPr>
-          <w:t>28:18–20</w:t>
-        </w:r>
-      </w:hyperlink>
-      <w:r>
-        <w:rPr>
-          <w:lang w:val="en_US" w:bidi="en_US"/>
-        </w:rPr>
-        <w:t xml:space="preserve">; </w:t>
-      </w:r>
-      <w:hyperlink r:id="rId310">
-        <w:r>
-          <w:rPr>
-            <w:lang w:val="en_US" w:bidi="en_US"/>
-          </w:rPr>
-          <w:rPr>
-            <w:color w:val="0000EE"/>
-            <w:u w:val="single"/>
-          </w:rPr>
-          <w:t>Mark 1:15–20</w:t>
-        </w:r>
-      </w:hyperlink>
-      <w:r>
-        <w:rPr>
-          <w:lang w:val="en_US" w:bidi="en_US"/>
-        </w:rPr>
-        <w:t xml:space="preserve">; </w:t>
-      </w:r>
-      <w:hyperlink r:id="rId311">
-        <w:r>
-          <w:rPr>
-            <w:lang w:val="en_US" w:bidi="en_US"/>
-          </w:rPr>
-          <w:rPr>
-            <w:color w:val="0000EE"/>
-            <w:u w:val="single"/>
-          </w:rPr>
-          <w:t>2:14–15</w:t>
-        </w:r>
-      </w:hyperlink>
-      <w:r>
-        <w:rPr>
-          <w:lang w:val="en_US" w:bidi="en_US"/>
-        </w:rPr>
-        <w:t xml:space="preserve">; </w:t>
-      </w:r>
-      <w:hyperlink r:id="rId312">
-        <w:r>
-          <w:rPr>
-            <w:lang w:val="en_US" w:bidi="en_US"/>
-          </w:rPr>
-          <w:rPr>
-            <w:color w:val="0000EE"/>
-            <w:u w:val="single"/>
-          </w:rPr>
-          <w:t>3:13–15</w:t>
-        </w:r>
-      </w:hyperlink>
-      <w:r>
-        <w:rPr>
-          <w:lang w:val="en_US" w:bidi="en_US"/>
-        </w:rPr>
-        <w:t xml:space="preserve">; </w:t>
-      </w:r>
-      <w:hyperlink r:id="rId313">
-        <w:r>
-          <w:rPr>
-            <w:lang w:val="en_US" w:bidi="en_US"/>
-          </w:rPr>
-          <w:rPr>
-            <w:color w:val="0000EE"/>
-            <w:u w:val="single"/>
-          </w:rPr>
-          <w:t>5:18–20</w:t>
-        </w:r>
-      </w:hyperlink>
-      <w:r>
-        <w:rPr>
-          <w:lang w:val="en_US" w:bidi="en_US"/>
-        </w:rPr>
-        <w:t xml:space="preserve">; </w:t>
-      </w:r>
-      <w:hyperlink r:id="rId314">
-        <w:r>
-          <w:rPr>
-            <w:lang w:val="en_US" w:bidi="en_US"/>
-          </w:rPr>
-          <w:rPr>
-            <w:color w:val="0000EE"/>
-            <w:u w:val="single"/>
-          </w:rPr>
-          <w:t>6:6–13</w:t>
-        </w:r>
-      </w:hyperlink>
-      <w:r>
-        <w:rPr>
-          <w:lang w:val="en_US" w:bidi="en_US"/>
-        </w:rPr>
-        <w:t xml:space="preserve">, </w:t>
-      </w:r>
-      <w:hyperlink r:id="rId315">
-        <w:r>
-          <w:rPr>
-            <w:lang w:val="en_US" w:bidi="en_US"/>
-          </w:rPr>
-          <w:rPr>
-            <w:color w:val="0000EE"/>
-            <w:u w:val="single"/>
-          </w:rPr>
-          <w:t>30–32</w:t>
-        </w:r>
-      </w:hyperlink>
-      <w:r>
-        <w:rPr>
-          <w:lang w:val="en_US" w:bidi="en_US"/>
-        </w:rPr>
-        <w:t xml:space="preserve">; </w:t>
-      </w:r>
-      <w:hyperlink r:id="rId316">
-        <w:r>
-          <w:rPr>
-            <w:lang w:val="en_US" w:bidi="en_US"/>
-          </w:rPr>
-          <w:rPr>
-            <w:color w:val="0000EE"/>
-            <w:u w:val="single"/>
-          </w:rPr>
-          <w:t>8:34–38</w:t>
-        </w:r>
-      </w:hyperlink>
-      <w:r>
-        <w:rPr>
-          <w:lang w:val="en_US" w:bidi="en_US"/>
-        </w:rPr>
-        <w:t xml:space="preserve">; </w:t>
-      </w:r>
-      <w:hyperlink r:id="rId317">
-        <w:r>
-          <w:rPr>
-            <w:lang w:val="en_US" w:bidi="en_US"/>
-          </w:rPr>
-          <w:rPr>
-            <w:color w:val="0000EE"/>
-            <w:u w:val="single"/>
-          </w:rPr>
-          <w:t>9:38–50</w:t>
-        </w:r>
-      </w:hyperlink>
-      <w:r>
-        <w:rPr>
-          <w:lang w:val="en_US" w:bidi="en_US"/>
-        </w:rPr>
-        <w:t xml:space="preserve">; </w:t>
-      </w:r>
-      <w:hyperlink r:id="rId318">
-        <w:r>
-          <w:rPr>
-            <w:lang w:val="en_US" w:bidi="en_US"/>
-          </w:rPr>
-          <w:rPr>
-            <w:color w:val="0000EE"/>
-            <w:u w:val="single"/>
-          </w:rPr>
-          <w:t>10:17–31</w:t>
-        </w:r>
-      </w:hyperlink>
-      <w:r>
-        <w:rPr>
-          <w:lang w:val="en_US" w:bidi="en_US"/>
-        </w:rPr>
-        <w:t xml:space="preserve">; </w:t>
-      </w:r>
-      <w:hyperlink r:id="rId319">
-        <w:r>
-          <w:rPr>
-            <w:lang w:val="en_US" w:bidi="en_US"/>
-          </w:rPr>
-          <w:rPr>
-            <w:color w:val="0000EE"/>
-            <w:u w:val="single"/>
-          </w:rPr>
-          <w:t>11:22–25</w:t>
-        </w:r>
-      </w:hyperlink>
-      <w:r>
-        <w:rPr>
-          <w:lang w:val="en_US" w:bidi="en_US"/>
-        </w:rPr>
-        <w:t xml:space="preserve">; </w:t>
-      </w:r>
-      <w:hyperlink r:id="rId320">
-        <w:r>
-          <w:rPr>
-            <w:lang w:val="en_US" w:bidi="en_US"/>
-          </w:rPr>
-          <w:rPr>
-            <w:color w:val="0000EE"/>
-            <w:u w:val="single"/>
-          </w:rPr>
-          <w:t>13:9–13</w:t>
-        </w:r>
-      </w:hyperlink>
-      <w:r>
-        <w:rPr>
-          <w:lang w:val="en_US" w:bidi="en_US"/>
-        </w:rPr>
-        <w:t xml:space="preserve">; </w:t>
-      </w:r>
-      <w:hyperlink r:id="rId321">
-        <w:r>
-          <w:rPr>
-            <w:lang w:val="en_US" w:bidi="en_US"/>
-          </w:rPr>
-          <w:rPr>
-            <w:color w:val="0000EE"/>
-            <w:u w:val="single"/>
-          </w:rPr>
-          <w:t>Luke 14:25–35</w:t>
-        </w:r>
-      </w:hyperlink>
-      <w:r>
-        <w:rPr>
-          <w:lang w:val="en_US" w:bidi="en_US"/>
-        </w:rPr>
-        <w:t xml:space="preserve">; </w:t>
-      </w:r>
-      <w:hyperlink r:id="rId281">
-        <w:r>
-          <w:rPr>
-            <w:lang w:val="en_US" w:bidi="en_US"/>
-          </w:rPr>
-          <w:rPr>
-            <w:color w:val="0000EE"/>
-            <w:u w:val="single"/>
-          </w:rPr>
-          <w:t>24:47–49</w:t>
-        </w:r>
-      </w:hyperlink>
-      <w:r>
-        <w:rPr>
-          <w:lang w:val="en_US" w:bidi="en_US"/>
-        </w:rPr>
-        <w:t xml:space="preserve">; </w:t>
-      </w:r>
-      <w:hyperlink r:id="rId322">
-        <w:r>
-          <w:rPr>
-            <w:lang w:val="en_US" w:bidi="en_US"/>
-          </w:rPr>
-          <w:rPr>
-            <w:color w:val="0000EE"/>
-            <w:u w:val="single"/>
-          </w:rPr>
-          <w:t>John 8:12</w:t>
+          <w:t>Acts 1:8</w:t>
         </w:r>
       </w:hyperlink>
       <w:r>
@@ -8525,7 +8539,7 @@
             <w:color w:val="0000EE"/>
             <w:u w:val="single"/>
           </w:rPr>
-          <w:t>10:27</w:t>
+          <w:t>2:42–47</w:t>
         </w:r>
       </w:hyperlink>
       <w:r>
@@ -8543,25 +8557,25 @@
             <w:color w:val="0000EE"/>
             <w:u w:val="single"/>
           </w:rPr>
-          <w:t>12:26</w:t>
-        </w:r>
-      </w:hyperlink>
-      <w:r>
-        <w:rPr>
-          <w:lang w:val="en_US" w:bidi="en_US"/>
-        </w:rPr>
-        <w:t xml:space="preserve">; </w:t>
-      </w:r>
-      <w:hyperlink r:id="rId282">
-        <w:r>
-          <w:rPr>
-            <w:lang w:val="en_US" w:bidi="en_US"/>
-          </w:rPr>
-          <w:rPr>
-            <w:color w:val="0000EE"/>
-            <w:u w:val="single"/>
-          </w:rPr>
-          <w:t>Acts 1:8</w:t>
+          <w:t>4:16–20</w:t>
+        </w:r>
+      </w:hyperlink>
+      <w:r>
+        <w:rPr>
+          <w:lang w:val="en_US" w:bidi="en_US"/>
+        </w:rPr>
+        <w:t xml:space="preserve">; </w:t>
+      </w:r>
+      <w:hyperlink r:id="rId285">
+        <w:r>
+          <w:rPr>
+            <w:lang w:val="en_US" w:bidi="en_US"/>
+          </w:rPr>
+          <w:rPr>
+            <w:color w:val="0000EE"/>
+            <w:u w:val="single"/>
+          </w:rPr>
+          <w:t>8:4</w:t>
         </w:r>
       </w:hyperlink>
       <w:r>
@@ -8579,7 +8593,7 @@
             <w:color w:val="0000EE"/>
             <w:u w:val="single"/>
           </w:rPr>
-          <w:t>2:42–47</w:t>
+          <w:t>9:19–30</w:t>
         </w:r>
       </w:hyperlink>
       <w:r>
@@ -8597,25 +8611,43 @@
             <w:color w:val="0000EE"/>
             <w:u w:val="single"/>
           </w:rPr>
-          <w:t>4:16–20</w:t>
-        </w:r>
-      </w:hyperlink>
-      <w:r>
-        <w:rPr>
-          <w:lang w:val="en_US" w:bidi="en_US"/>
-        </w:rPr>
-        <w:t xml:space="preserve">; </w:t>
-      </w:r>
-      <w:hyperlink r:id="rId287">
-        <w:r>
-          <w:rPr>
-            <w:lang w:val="en_US" w:bidi="en_US"/>
-          </w:rPr>
-          <w:rPr>
-            <w:color w:val="0000EE"/>
-            <w:u w:val="single"/>
-          </w:rPr>
-          <w:t>8:4</w:t>
+          <w:t>11:19–24</w:t>
+        </w:r>
+      </w:hyperlink>
+      <w:r>
+        <w:rPr>
+          <w:lang w:val="en_US" w:bidi="en_US"/>
+        </w:rPr>
+        <w:t xml:space="preserve">; </w:t>
+      </w:r>
+      <w:hyperlink r:id="rId288">
+        <w:r>
+          <w:rPr>
+            <w:lang w:val="en_US" w:bidi="en_US"/>
+          </w:rPr>
+          <w:rPr>
+            <w:color w:val="0000EE"/>
+            <w:u w:val="single"/>
+          </w:rPr>
+          <w:t>13:1–3</w:t>
+        </w:r>
+      </w:hyperlink>
+      <w:r>
+        <w:rPr>
+          <w:lang w:val="en_US" w:bidi="en_US"/>
+        </w:rPr>
+        <w:t xml:space="preserve">; </w:t>
+      </w:r>
+      <w:hyperlink r:id="rId289">
+        <w:r>
+          <w:rPr>
+            <w:lang w:val="en_US" w:bidi="en_US"/>
+          </w:rPr>
+          <w:rPr>
+            <w:color w:val="0000EE"/>
+            <w:u w:val="single"/>
+          </w:rPr>
+          <w:t>Romans 1:1–16</w:t>
         </w:r>
       </w:hyperlink>
       <w:r>
@@ -8633,7 +8665,25 @@
             <w:color w:val="0000EE"/>
             <w:u w:val="single"/>
           </w:rPr>
-          <w:t>9:19–30</w:t>
+          <w:t>10:7–15</w:t>
+        </w:r>
+      </w:hyperlink>
+      <w:r>
+        <w:rPr>
+          <w:lang w:val="en_US" w:bidi="en_US"/>
+        </w:rPr>
+        <w:t xml:space="preserve">; </w:t>
+      </w:r>
+      <w:hyperlink r:id="rId292">
+        <w:r>
+          <w:rPr>
+            <w:lang w:val="en_US" w:bidi="en_US"/>
+          </w:rPr>
+          <w:rPr>
+            <w:color w:val="0000EE"/>
+            <w:u w:val="single"/>
+          </w:rPr>
+          <w:t>1 Corinthians 9:16</w:t>
         </w:r>
       </w:hyperlink>
       <w:r>
@@ -8651,43 +8701,43 @@
             <w:color w:val="0000EE"/>
             <w:u w:val="single"/>
           </w:rPr>
-          <w:t>11:19–24</w:t>
-        </w:r>
-      </w:hyperlink>
-      <w:r>
-        <w:rPr>
-          <w:lang w:val="en_US" w:bidi="en_US"/>
-        </w:rPr>
-        <w:t xml:space="preserve">; </w:t>
-      </w:r>
-      <w:hyperlink r:id="rId290">
-        <w:r>
-          <w:rPr>
-            <w:lang w:val="en_US" w:bidi="en_US"/>
-          </w:rPr>
-          <w:rPr>
-            <w:color w:val="0000EE"/>
-            <w:u w:val="single"/>
-          </w:rPr>
-          <w:t>13:1–3</w:t>
-        </w:r>
-      </w:hyperlink>
-      <w:r>
-        <w:rPr>
-          <w:lang w:val="en_US" w:bidi="en_US"/>
-        </w:rPr>
-        <w:t xml:space="preserve">; </w:t>
-      </w:r>
-      <w:hyperlink r:id="rId291">
-        <w:r>
-          <w:rPr>
-            <w:lang w:val="en_US" w:bidi="en_US"/>
-          </w:rPr>
-          <w:rPr>
-            <w:color w:val="0000EE"/>
-            <w:u w:val="single"/>
-          </w:rPr>
-          <w:t>Romans 1:1–16</w:t>
+          <w:t>Ephesians 5:1</w:t>
+        </w:r>
+      </w:hyperlink>
+      <w:r>
+        <w:rPr>
+          <w:lang w:val="en_US" w:bidi="en_US"/>
+        </w:rPr>
+        <w:t xml:space="preserve">; </w:t>
+      </w:r>
+      <w:hyperlink r:id="rId293">
+        <w:r>
+          <w:rPr>
+            <w:lang w:val="en_US" w:bidi="en_US"/>
+          </w:rPr>
+          <w:rPr>
+            <w:color w:val="0000EE"/>
+            <w:u w:val="single"/>
+          </w:rPr>
+          <w:t>Colossians 1:23</w:t>
+        </w:r>
+      </w:hyperlink>
+      <w:r>
+        <w:rPr>
+          <w:lang w:val="en_US" w:bidi="en_US"/>
+        </w:rPr>
+        <w:t xml:space="preserve">; </w:t>
+      </w:r>
+      <w:hyperlink r:id="rId295">
+        <w:r>
+          <w:rPr>
+            <w:lang w:val="en_US" w:bidi="en_US"/>
+          </w:rPr>
+          <w:rPr>
+            <w:color w:val="0000EE"/>
+            <w:u w:val="single"/>
+          </w:rPr>
+          <w:t>2 Timothy 4:2</w:t>
         </w:r>
       </w:hyperlink>
       <w:r>
@@ -8697,96 +8747,6 @@
         <w:t xml:space="preserve">; </w:t>
       </w:r>
       <w:hyperlink r:id="rId329">
-        <w:r>
-          <w:rPr>
-            <w:lang w:val="en_US" w:bidi="en_US"/>
-          </w:rPr>
-          <w:rPr>
-            <w:color w:val="0000EE"/>
-            <w:u w:val="single"/>
-          </w:rPr>
-          <w:t>10:7–15</w:t>
-        </w:r>
-      </w:hyperlink>
-      <w:r>
-        <w:rPr>
-          <w:lang w:val="en_US" w:bidi="en_US"/>
-        </w:rPr>
-        <w:t xml:space="preserve">; </w:t>
-      </w:r>
-      <w:hyperlink r:id="rId294">
-        <w:r>
-          <w:rPr>
-            <w:lang w:val="en_US" w:bidi="en_US"/>
-          </w:rPr>
-          <w:rPr>
-            <w:color w:val="0000EE"/>
-            <w:u w:val="single"/>
-          </w:rPr>
-          <w:t>1 Corinthians 9:16</w:t>
-        </w:r>
-      </w:hyperlink>
-      <w:r>
-        <w:rPr>
-          <w:lang w:val="en_US" w:bidi="en_US"/>
-        </w:rPr>
-        <w:t xml:space="preserve">; </w:t>
-      </w:r>
-      <w:hyperlink r:id="rId330">
-        <w:r>
-          <w:rPr>
-            <w:lang w:val="en_US" w:bidi="en_US"/>
-          </w:rPr>
-          <w:rPr>
-            <w:color w:val="0000EE"/>
-            <w:u w:val="single"/>
-          </w:rPr>
-          <w:t>Ephesians 5:1</w:t>
-        </w:r>
-      </w:hyperlink>
-      <w:r>
-        <w:rPr>
-          <w:lang w:val="en_US" w:bidi="en_US"/>
-        </w:rPr>
-        <w:t xml:space="preserve">; </w:t>
-      </w:r>
-      <w:hyperlink r:id="rId295">
-        <w:r>
-          <w:rPr>
-            <w:lang w:val="en_US" w:bidi="en_US"/>
-          </w:rPr>
-          <w:rPr>
-            <w:color w:val="0000EE"/>
-            <w:u w:val="single"/>
-          </w:rPr>
-          <w:t>Colossians 1:23</w:t>
-        </w:r>
-      </w:hyperlink>
-      <w:r>
-        <w:rPr>
-          <w:lang w:val="en_US" w:bidi="en_US"/>
-        </w:rPr>
-        <w:t xml:space="preserve">; </w:t>
-      </w:r>
-      <w:hyperlink r:id="rId297">
-        <w:r>
-          <w:rPr>
-            <w:lang w:val="en_US" w:bidi="en_US"/>
-          </w:rPr>
-          <w:rPr>
-            <w:color w:val="0000EE"/>
-            <w:u w:val="single"/>
-          </w:rPr>
-          <w:t>2 Timothy 4:2</w:t>
-        </w:r>
-      </w:hyperlink>
-      <w:r>
-        <w:rPr>
-          <w:lang w:val="en_US" w:bidi="en_US"/>
-        </w:rPr>
-        <w:t xml:space="preserve">; </w:t>
-      </w:r>
-      <w:hyperlink r:id="rId331">
         <w:r>
           <w:rPr>
             <w:lang w:val="en_US" w:bidi="en_US"/>
@@ -8846,7 +8806,7 @@
         </w:rPr>
         <w:t xml:space="preserve">The book of Daniel describes two important visions that show how God rules over all of history. King Nebuchadnezzar of Babylon had the first vision (chapter </w:t>
       </w:r>
-      <w:hyperlink r:id="rId332">
+      <w:hyperlink r:id="rId330">
         <w:r>
           <w:rPr>
             <w:lang w:val="en_US" w:bidi="en_US"/>
@@ -8864,7 +8824,7 @@
         </w:rPr>
         <w:t xml:space="preserve">), and the prophet Daniel had a similar one (chapter </w:t>
       </w:r>
-      <w:hyperlink r:id="rId333">
+      <w:hyperlink r:id="rId331">
         <w:r>
           <w:rPr>
             <w:lang w:val="en_US" w:bidi="en_US"/>
@@ -9010,7 +8970,7 @@
         </w:rPr>
         <w:t>People generally consider Rome to be the fourth kingdom. But the evil and inhuman qualities described in the vision go beyond just the historical Roman Empire. The visions show a view of the world and its governments. The kingdom of God will destroy and replace all. It is "a stone … cut out” (</w:t>
       </w:r>
-      <w:hyperlink r:id="rId334">
+      <w:hyperlink r:id="rId332">
         <w:r>
           <w:rPr>
             <w:lang w:val="en_US" w:bidi="en_US"/>
@@ -9028,7 +8988,7 @@
         </w:rPr>
         <w:t xml:space="preserve">). In chapter </w:t>
       </w:r>
-      <w:hyperlink r:id="rId332">
+      <w:hyperlink r:id="rId330">
         <w:r>
           <w:rPr>
             <w:lang w:val="en_US" w:bidi="en_US"/>
@@ -9046,25 +9006,25 @@
         </w:rPr>
         <w:t xml:space="preserve">, the statue's metals become less valuable. While in chapter </w:t>
       </w:r>
+      <w:hyperlink r:id="rId331">
+        <w:r>
+          <w:rPr>
+            <w:lang w:val="en_US" w:bidi="en_US"/>
+          </w:rPr>
+          <w:rPr>
+            <w:color w:val="0000EE"/>
+            <w:u w:val="single"/>
+          </w:rPr>
+          <w:t>7</w:t>
+        </w:r>
+      </w:hyperlink>
+      <w:r>
+        <w:rPr>
+          <w:lang w:val="en_US" w:bidi="en_US"/>
+        </w:rPr>
+        <w:t>, the animal imagery becomes more fierce and violent. These features show a decline in human civilization over time, even as the kingdom of God increases in power and size (</w:t>
+      </w:r>
       <w:hyperlink r:id="rId333">
-        <w:r>
-          <w:rPr>
-            <w:lang w:val="en_US" w:bidi="en_US"/>
-          </w:rPr>
-          <w:rPr>
-            <w:color w:val="0000EE"/>
-            <w:u w:val="single"/>
-          </w:rPr>
-          <w:t>7</w:t>
-        </w:r>
-      </w:hyperlink>
-      <w:r>
-        <w:rPr>
-          <w:lang w:val="en_US" w:bidi="en_US"/>
-        </w:rPr>
-        <w:t>, the animal imagery becomes more fierce and violent. These features show a decline in human civilization over time, even as the kingdom of God increases in power and size (</w:t>
-      </w:r>
-      <w:hyperlink r:id="rId335">
         <w:r>
           <w:rPr>
             <w:lang w:val="en_US" w:bidi="en_US"/>
@@ -9105,7 +9065,7 @@
           <w:lang w:val="en_US" w:bidi="en_US"/>
         </w:rPr>
       </w:r>
-      <w:hyperlink r:id="rId332">
+      <w:hyperlink r:id="rId330">
         <w:r>
           <w:rPr>
             <w:lang w:val="en_US" w:bidi="en_US"/>
@@ -9123,7 +9083,7 @@
         </w:rPr>
         <w:t xml:space="preserve">; </w:t>
       </w:r>
-      <w:hyperlink r:id="rId333">
+      <w:hyperlink r:id="rId331">
         <w:r>
           <w:rPr>
             <w:lang w:val="en_US" w:bidi="en_US"/>

</xml_diff>